<commit_message>
Revert the activation link to a 10-minute default
Reverses ba476c4. The 72-hour change would have altered behaviour in the
tenant activation flow (GAS-102), which is already Ready for Test, and
that ticket is deliberately not being touched. The window stays a
configurable per-environment setting; only the default returns to 10
minutes.

The Resend removal from ba476c4 is unaffected and stands.

Co-Authored-By: Claude Opus 5 <noreply@anthropic.com>
Claude-Session: https://claude.ai/code/session_01K4sYx62rsZE8FLFyiFKqEH
</commit_message>
<xml_diff>
--- a/docs/Appro_BRD_Tenant_UserRoleManagement_v2.3.docx
+++ b/docs/Appro_BRD_Tenant_UserRoleManagement_v2.3.docx
@@ -624,15 +624,7 @@
               <w:rPr>
                 <w:color w:val="B45309"/>
               </w:rPr>
-              <w:t>Added account activation to the tenant module (CLR-013), bringing it to parity with the Super Admin Portal URM v1.4. Member creation now sends an invitation email carrying a single-use set-password / activation link (configurable expiry, 72-hour default) and lands the member on a new Activate Account screen (2.8.2) where they set a password, accept the Terms of Use and activate the account. Members are created as Invited, not Active (2.9 AC2); the three-state status is surfaced on the user list (2.7) and the Status filter (2.7.1). Added the ActivationToken entity and member credential fields (2.10), NFR-7/NFR-8, notification templates TT01–TT05 (2.12), user stories US-7/US-8 and impact rows. The dual local-password / SSO model is stated explicitly (2.8.1).</w:t>
-            </w:r>
-            <w:r>
-              <w:rPr>
-                <w:b/>
-                <w:color w:val="B45309"/>
-                <w:sz w:val="15"/>
-              </w:rPr>
-              <w:t xml:space="preserve">  [72h · CLR-014]</w:t>
+              <w:t>Added account activation to the tenant module (CLR-013), bringing it to parity with the Super Admin Portal URM v1.4. Member creation now sends an invitation email carrying a single-use set-password / activation link (configurable expiry, 10-minute default) and lands the member on a new Activate Account screen (2.8.2) where they set a password, accept the Terms of Use and activate the account. Members are created as Invited, not Active (2.9 AC2); the three-state status is surfaced on the user list (2.7) and the Status filter (2.7.1). Added the ActivationToken entity and member credential fields (2.10), NFR-7/NFR-8, notification templates TT01–TT05 (2.12), user stories US-7/US-8 and impact rows. The dual local-password / SSO model is stated explicitly (2.8.1).</w:t>
             </w:r>
           </w:p>
         </w:tc>
@@ -4619,15 +4611,7 @@
           <w:color w:val="13233A"/>
           <w:sz w:val="21"/>
         </w:rPr>
-        <w:t>Local password. On save, the backend creates the member with Status = Active and sends an activation email carrying a single-use set-password / activation link of the form …/activate?token=&lt;token&gt; to the User Email (template TT01). The member cannot sign in until the link is completed — access is gated by the absence of a credential, not by a status. The link expiry is a configurable per-environment setting (72-hour default; see NFR-7), and whether a given link is still usable is DERIVED by comparing the generated-link date against that setting. No link-validity duration is displayed on screen.  [UPDATED v2.3 · CLR-014]</w:t>
-      </w:r>
-      <w:r>
-        <w:rPr>
-          <w:b/>
-          <w:color w:val="B45309"/>
-          <w:sz w:val="15"/>
-        </w:rPr>
-        <w:t xml:space="preserve">  [72h · CLR-014]</w:t>
+        <w:t>Local password. On save, the backend creates the member with Status = Active and sends an activation email carrying a single-use set-password / activation link of the form …/activate?token=&lt;token&gt; to the User Email (template TT01). The member cannot sign in until the link is completed — access is gated by the absence of a credential, not by a status. The link expiry is a configurable per-environment setting (10-minute default; see NFR-7), and whether a given link is still usable is DERIVED by comparing the generated-link date against that setting. No link-validity duration is displayed on screen.  [UPDATED v2.3 · CLR-014]</w:t>
       </w:r>
     </w:p>
     <w:p>
@@ -4674,14 +4658,6 @@
           <w:sz w:val="21"/>
         </w:rPr>
         <w:t>Resend invitation. There is NO administrator Resend action — not on the member list and not on the Edit-user screen (CLR-014). A fresh link is issued only by the member themselves, from the expired activation screen; doing so issues a fresh link with a new expiry window and invalidates the previous one (template TT03), so only the most recent link works. It is deliberately NOT surfaced on the member list, which shows status only. The action requires the Invite user permission (Appendix A).  [UPDATED v2.3 · CLR-014]</w:t>
-      </w:r>
-      <w:r>
-        <w:rPr>
-          <w:b/>
-          <w:color w:val="B45309"/>
-          <w:sz w:val="15"/>
-        </w:rPr>
-        <w:t xml:space="preserve">  [72h · CLR-014]</w:t>
       </w:r>
     </w:p>
     <w:p>
@@ -5485,15 +5461,7 @@
           </w:tcPr>
           <w:p>
             <w:r>
-              <w:t>States how long the link remains valid, using the SERVER-SUPPLIED expiry value (e.g. "72 hours"). It must never be hardcoded — a notice that disagrees with the real TTL sends members away after the window has closed.</w:t>
-            </w:r>
-            <w:r>
-              <w:rPr>
-                <w:b/>
-                <w:color w:val="B45309"/>
-                <w:sz w:val="15"/>
-              </w:rPr>
-              <w:t xml:space="preserve">  [72h · CLR-014]</w:t>
+              <w:t>States how long the link remains valid, using the SERVER-SUPPLIED expiry value (e.g. "10 minutes"). It must never be hardcoded — a notice that disagrees with the real TTL sends members away after the window has closed.</w:t>
             </w:r>
           </w:p>
         </w:tc>
@@ -5904,15 +5872,7 @@
           <w:color w:val="13233A"/>
           <w:sz w:val="21"/>
         </w:rPr>
-        <w:t>AC4 — Expiry mid-form. A token that was valid at page load but has expired by submit is rejected on submit; the member is moved to the expired mode and offered a fresh link from that screen. At a 72-hour default TTL this is a normal path, not an edge case.</w:t>
-      </w:r>
-      <w:r>
-        <w:rPr>
-          <w:b/>
-          <w:color w:val="B45309"/>
-          <w:sz w:val="15"/>
-        </w:rPr>
-        <w:t xml:space="preserve">  [72h · CLR-014]</w:t>
+        <w:t>AC4 — Expiry mid-form. A token that was valid at page load but has expired by submit is rejected on submit; the member is moved to the expired mode and offered a fresh link from that screen. At a 10-minute default TTL this is a normal path, not an edge case.</w:t>
       </w:r>
     </w:p>
     <w:p>
@@ -6311,15 +6271,7 @@
           </w:tcPr>
           <w:p>
             <w:r>
-              <w:t>tokenId, memberId, tenantId, tokenHash (single-use), generatedAt, expiresAt (derived: generatedAt + the configurable window, default 72 h — 2.8.1 / NFR-7), consumedAt. Issued on create and on Resend invitation; issuing a new token invalidates the previous one. Only the hash is persisted.  [UPDATED v2.3 · CLR-014]</w:t>
-            </w:r>
-            <w:r>
-              <w:rPr>
-                <w:b/>
-                <w:color w:val="B45309"/>
-                <w:sz w:val="15"/>
-              </w:rPr>
-              <w:t xml:space="preserve">  [72h · CLR-014]</w:t>
+              <w:t>tokenId, memberId, tenantId, tokenHash (single-use), generatedAt, expiresAt (derived: generatedAt + the configurable window, default 10 min — 2.8.1 / NFR-7), consumedAt. Issued on create and on Resend invitation; issuing a new token invalidates the previous one. Only the hash is persisted.  [UPDATED v2.3 · CLR-014]</w:t>
             </w:r>
           </w:p>
         </w:tc>
@@ -6773,15 +6725,7 @@
           </w:tcPr>
           <w:p>
             <w:r>
-              <w:t>Invitation / set-password (activation) links are single-use, time-limited and delivered only to the target User Email. The expiry window MUST be configurable per environment (72-hour default) and a link’s validity MUST be computed from its generated-link date against that window, never from a stored invitation status. The duration is not displayed to the member.  [UPDATED v2.3 · CLR-014]</w:t>
-            </w:r>
-            <w:r>
-              <w:rPr>
-                <w:b/>
-                <w:color w:val="B45309"/>
-                <w:sz w:val="15"/>
-              </w:rPr>
-              <w:t xml:space="preserve">  [72h · CLR-014]</w:t>
+              <w:t>Invitation / set-password (activation) links are single-use, time-limited and delivered only to the target User Email. The expiry window MUST be configurable per environment (10-minute default) and a link’s validity MUST be computed from its generated-link date against that window, never from a stored invitation status. The duration is not displayed to the member.  [UPDATED v2.3 · CLR-014]</w:t>
             </w:r>
           </w:p>
         </w:tc>
@@ -8139,15 +8083,7 @@
           </w:tcPr>
           <w:p>
             <w:r>
-              <w:t>Create members with status Active (there is no Invited status) and gate sign-in on the credential, not the status. Build the Activate Account screen served at …/activate?token= on the Customer Portal, reusing the tenant-onboarding token contract (SHA-256 hash, single-use). Expose the link-expiry window as a configurable per-environment setting (72-hour default) and compute validity from the generated-link date. Do not display the duration on screen.  [UPDATED v2.3 · CLR-014]</w:t>
-            </w:r>
-            <w:r>
-              <w:rPr>
-                <w:b/>
-                <w:color w:val="B45309"/>
-                <w:sz w:val="15"/>
-              </w:rPr>
-              <w:t xml:space="preserve">  [72h · CLR-014]</w:t>
+              <w:t>Create members with status Active (there is no Invited status) and gate sign-in on the credential, not the status. Build the Activate Account screen served at …/activate?token= on the Customer Portal, reusing the tenant-onboarding token contract (SHA-256 hash, single-use). Expose the link-expiry window as a configurable per-environment setting (10-minute default) and compute validity from the generated-link date. Do not display the duration on screen.  [UPDATED v2.3 · CLR-014]</w:t>
             </w:r>
           </w:p>
         </w:tc>

</xml_diff>